<commit_message>
Build v4.0 verification artifacts and submission package
</commit_message>
<xml_diff>
--- a/paper/UCD_YM_Jaffe_Witten_Submission_v4.docx
+++ b/paper/UCD_YM_Jaffe_Witten_Submission_v4.docx
@@ -14452,7 +14452,1423 @@
       </w:r>
     </w:p>
     <w:bookmarkEnd w:id="35"/>
-    <w:bookmarkStart w:id="36" w:name="X04db9635e6b096c532c66877395a0d22a1208ce"/>
+    <w:bookmarkStart w:id="36" w:name="X23e6b541995d7225aea9c2ef0ba492b723b4a52"/>
+    <w:p>
+      <w:pPr>
+        <w:pStyle w:val="Heading1"/>
+      </w:pPr>
+      <w:r>
+        <w:t xml:space="preserve">15.1 Local curvature fields, stress tensor, and short-distance operator structure</w:t>
+      </w:r>
+    </w:p>
+    <w:p>
+      <w:pPr>
+        <w:pStyle w:val="FirstParagraph"/>
+      </w:pPr>
+      <w:r>
+        <w:t xml:space="preserve">The Jaffe–Witten specification requires the continuum theory to contain local gauge-invariant quantum fields corresponding to classical gauge-invariant differential polynomials in the curvature and its covariant derivatives. Let</w:t>
+      </w:r>
+    </w:p>
+    <w:p>
+      <w:pPr>
+        <w:pStyle w:val="BodyText"/>
+      </w:pPr>
+      <m:oMathPara>
+        <m:oMathParaPr>
+          <m:jc m:val="center"/>
+        </m:oMathParaPr>
+        <m:oMath>
+          <m:r>
+            <m:t>P</m:t>
+          </m:r>
+          <m:d>
+            <m:dPr>
+              <m:begChr m:val="("/>
+              <m:endChr m:val=")"/>
+              <m:sepChr m:val=""/>
+              <m:grow/>
+            </m:dPr>
+            <m:e>
+              <m:r>
+                <m:t>F</m:t>
+              </m:r>
+              <m:r>
+                <m:rPr>
+                  <m:sty m:val="p"/>
+                </m:rPr>
+                <m:t>,</m:t>
+              </m:r>
+              <m:r>
+                <m:t>D</m:t>
+              </m:r>
+              <m:r>
+                <m:t>F</m:t>
+              </m:r>
+              <m:r>
+                <m:rPr>
+                  <m:sty m:val="p"/>
+                </m:rPr>
+                <m:t>,</m:t>
+              </m:r>
+              <m:sSup>
+                <m:e>
+                  <m:r>
+                    <m:t>D</m:t>
+                  </m:r>
+                </m:e>
+                <m:sup>
+                  <m:r>
+                    <m:t>2</m:t>
+                  </m:r>
+                </m:sup>
+              </m:sSup>
+              <m:r>
+                <m:t>F</m:t>
+              </m:r>
+              <m:r>
+                <m:rPr>
+                  <m:sty m:val="p"/>
+                </m:rPr>
+                <m:t>,</m:t>
+              </m:r>
+              <m:r>
+                <m:rPr>
+                  <m:sty m:val="p"/>
+                </m:rPr>
+                <m:t>…</m:t>
+              </m:r>
+            </m:e>
+          </m:d>
+        </m:oMath>
+      </m:oMathPara>
+    </w:p>
+    <w:p>
+      <w:pPr>
+        <w:pStyle w:val="FirstParagraph"/>
+      </w:pPr>
+      <w:r>
+        <w:t xml:space="preserve">be such a polynomial of engineering dimension</w:t>
+      </w:r>
+      <w:r>
+        <w:t xml:space="preserve"> </w:t>
+      </w:r>
+      <m:oMath>
+        <m:sSub>
+          <m:e>
+            <m:r>
+              <m:t>d</m:t>
+            </m:r>
+          </m:e>
+          <m:sub>
+            <m:r>
+              <m:t>P</m:t>
+            </m:r>
+          </m:sub>
+        </m:sSub>
+      </m:oMath>
+      <w:r>
+        <w:t xml:space="preserve">. On a lattice, curvature is represented by oriented plaquette combinations. For</w:t>
+      </w:r>
+      <w:r>
+        <w:t xml:space="preserve"> </w:t>
+      </w:r>
+      <m:oMath>
+        <m:r>
+          <m:t>S</m:t>
+        </m:r>
+        <m:r>
+          <m:t>U</m:t>
+        </m:r>
+        <m:d>
+          <m:dPr>
+            <m:begChr m:val="("/>
+            <m:endChr m:val=")"/>
+            <m:sepChr m:val=""/>
+            <m:grow/>
+          </m:dPr>
+          <m:e>
+            <m:r>
+              <m:t>N</m:t>
+            </m:r>
+          </m:e>
+        </m:d>
+      </m:oMath>
+      <w:r>
+        <w:t xml:space="preserve"> </w:t>
+      </w:r>
+      <w:r>
+        <w:t xml:space="preserve">one convenient Lie-algebra-valued representative is</w:t>
+      </w:r>
+    </w:p>
+    <w:p>
+      <w:pPr>
+        <w:pStyle w:val="BodyText"/>
+      </w:pPr>
+      <m:oMathPara>
+        <m:oMathParaPr>
+          <m:jc m:val="center"/>
+        </m:oMathParaPr>
+        <m:oMath>
+          <m:sSubSup>
+            <m:e>
+              <m:r>
+                <m:t>F</m:t>
+              </m:r>
+            </m:e>
+            <m:sub>
+              <m:r>
+                <m:t>μ</m:t>
+              </m:r>
+              <m:r>
+                <m:t>ν</m:t>
+              </m:r>
+            </m:sub>
+            <m:sup>
+              <m:d>
+                <m:dPr>
+                  <m:begChr m:val="("/>
+                  <m:endChr m:val=")"/>
+                  <m:sepChr m:val=""/>
+                  <m:grow/>
+                </m:dPr>
+                <m:e>
+                  <m:r>
+                    <m:t>a</m:t>
+                  </m:r>
+                </m:e>
+              </m:d>
+            </m:sup>
+          </m:sSubSup>
+          <m:d>
+            <m:dPr>
+              <m:begChr m:val="("/>
+              <m:endChr m:val=")"/>
+              <m:sepChr m:val=""/>
+              <m:grow/>
+            </m:dPr>
+            <m:e>
+              <m:r>
+                <m:t>x</m:t>
+              </m:r>
+            </m:e>
+          </m:d>
+          <m:r>
+            <m:rPr>
+              <m:sty m:val="p"/>
+            </m:rPr>
+            <m:t>=</m:t>
+          </m:r>
+          <m:f>
+            <m:fPr>
+              <m:type m:val="bar"/>
+            </m:fPr>
+            <m:num>
+              <m:r>
+                <m:t>1</m:t>
+              </m:r>
+            </m:num>
+            <m:den>
+              <m:r>
+                <m:t>2</m:t>
+              </m:r>
+              <m:r>
+                <m:t>i</m:t>
+              </m:r>
+              <m:sSup>
+                <m:e>
+                  <m:r>
+                    <m:t>a</m:t>
+                  </m:r>
+                </m:e>
+                <m:sup>
+                  <m:r>
+                    <m:t>2</m:t>
+                  </m:r>
+                </m:sup>
+              </m:sSup>
+              <m:sSub>
+                <m:e>
+                  <m:r>
+                    <m:t>g</m:t>
+                  </m:r>
+                </m:e>
+                <m:sub>
+                  <m:r>
+                    <m:t>0</m:t>
+                  </m:r>
+                </m:sub>
+              </m:sSub>
+              <m:d>
+                <m:dPr>
+                  <m:begChr m:val="("/>
+                  <m:endChr m:val=")"/>
+                  <m:sepChr m:val=""/>
+                  <m:grow/>
+                </m:dPr>
+                <m:e>
+                  <m:r>
+                    <m:t>a</m:t>
+                  </m:r>
+                </m:e>
+              </m:d>
+            </m:den>
+          </m:f>
+          <m:d>
+            <m:dPr>
+              <m:begChr m:val="["/>
+              <m:endChr m:val="]"/>
+              <m:sepChr m:val=""/>
+              <m:grow/>
+            </m:dPr>
+            <m:e>
+              <m:sSub>
+                <m:e>
+                  <m:r>
+                    <m:t>U</m:t>
+                  </m:r>
+                </m:e>
+                <m:sub>
+                  <m:r>
+                    <m:t>μ</m:t>
+                  </m:r>
+                  <m:r>
+                    <m:t>ν</m:t>
+                  </m:r>
+                </m:sub>
+              </m:sSub>
+              <m:d>
+                <m:dPr>
+                  <m:begChr m:val="("/>
+                  <m:endChr m:val=")"/>
+                  <m:sepChr m:val=""/>
+                  <m:grow/>
+                </m:dPr>
+                <m:e>
+                  <m:r>
+                    <m:t>x</m:t>
+                  </m:r>
+                </m:e>
+              </m:d>
+              <m:r>
+                <m:rPr>
+                  <m:sty m:val="p"/>
+                </m:rPr>
+                <m:t>−</m:t>
+              </m:r>
+              <m:sSub>
+                <m:e>
+                  <m:r>
+                    <m:t>U</m:t>
+                  </m:r>
+                </m:e>
+                <m:sub>
+                  <m:r>
+                    <m:t>μ</m:t>
+                  </m:r>
+                  <m:r>
+                    <m:t>ν</m:t>
+                  </m:r>
+                </m:sub>
+              </m:sSub>
+              <m:sSup>
+                <m:e>
+                  <m:d>
+                    <m:dPr>
+                      <m:begChr m:val="("/>
+                      <m:endChr m:val=")"/>
+                      <m:sepChr m:val=""/>
+                      <m:grow/>
+                    </m:dPr>
+                    <m:e>
+                      <m:r>
+                        <m:t>x</m:t>
+                      </m:r>
+                    </m:e>
+                  </m:d>
+                </m:e>
+                <m:sup>
+                  <m:r>
+                    <m:rPr>
+                      <m:sty m:val="p"/>
+                    </m:rPr>
+                    <m:t>†</m:t>
+                  </m:r>
+                </m:sup>
+              </m:sSup>
+              <m:r>
+                <m:rPr>
+                  <m:sty m:val="p"/>
+                </m:rPr>
+                <m:t>−</m:t>
+              </m:r>
+              <m:f>
+                <m:fPr>
+                  <m:type m:val="bar"/>
+                </m:fPr>
+                <m:num>
+                  <m:r>
+                    <m:t>1</m:t>
+                  </m:r>
+                </m:num>
+                <m:den>
+                  <m:r>
+                    <m:t>N</m:t>
+                  </m:r>
+                </m:den>
+              </m:f>
+              <m:r>
+                <m:rPr>
+                  <m:sty m:val="p"/>
+                </m:rPr>
+                <m:t>Tr</m:t>
+              </m:r>
+              <m:r>
+                <m:rPr>
+                  <m:sty m:val="p"/>
+                </m:rPr>
+                <m:t>(</m:t>
+              </m:r>
+              <m:sSub>
+                <m:e>
+                  <m:r>
+                    <m:t>U</m:t>
+                  </m:r>
+                </m:e>
+                <m:sub>
+                  <m:r>
+                    <m:t>μ</m:t>
+                  </m:r>
+                  <m:r>
+                    <m:t>ν</m:t>
+                  </m:r>
+                </m:sub>
+              </m:sSub>
+              <m:d>
+                <m:dPr>
+                  <m:begChr m:val="("/>
+                  <m:endChr m:val=")"/>
+                  <m:sepChr m:val=""/>
+                  <m:grow/>
+                </m:dPr>
+                <m:e>
+                  <m:r>
+                    <m:t>x</m:t>
+                  </m:r>
+                </m:e>
+              </m:d>
+              <m:r>
+                <m:rPr>
+                  <m:sty m:val="p"/>
+                </m:rPr>
+                <m:t>−</m:t>
+              </m:r>
+              <m:sSub>
+                <m:e>
+                  <m:r>
+                    <m:t>U</m:t>
+                  </m:r>
+                </m:e>
+                <m:sub>
+                  <m:r>
+                    <m:t>μ</m:t>
+                  </m:r>
+                  <m:r>
+                    <m:t>ν</m:t>
+                  </m:r>
+                </m:sub>
+              </m:sSub>
+              <m:sSup>
+                <m:e>
+                  <m:d>
+                    <m:dPr>
+                      <m:begChr m:val="("/>
+                      <m:endChr m:val=")"/>
+                      <m:sepChr m:val=""/>
+                      <m:grow/>
+                    </m:dPr>
+                    <m:e>
+                      <m:r>
+                        <m:t>x</m:t>
+                      </m:r>
+                    </m:e>
+                  </m:d>
+                </m:e>
+                <m:sup>
+                  <m:r>
+                    <m:rPr>
+                      <m:sty m:val="p"/>
+                    </m:rPr>
+                    <m:t>†</m:t>
+                  </m:r>
+                </m:sup>
+              </m:sSup>
+              <m:r>
+                <m:rPr>
+                  <m:sty m:val="p"/>
+                </m:rPr>
+                <m:t>)</m:t>
+              </m:r>
+              <m:r>
+                <m:t>I</m:t>
+              </m:r>
+            </m:e>
+          </m:d>
+          <m:r>
+            <m:rPr>
+              <m:sty m:val="p"/>
+            </m:rPr>
+            <m:t>,</m:t>
+          </m:r>
+        </m:oMath>
+      </m:oMathPara>
+    </w:p>
+    <w:p>
+      <w:pPr>
+        <w:pStyle w:val="FirstParagraph"/>
+      </w:pPr>
+      <w:r>
+        <w:t xml:space="preserve">and covariant finite differences give approximants to</w:t>
+      </w:r>
+      <w:r>
+        <w:t xml:space="preserve"> </w:t>
+      </w:r>
+      <m:oMath>
+        <m:sSub>
+          <m:e>
+            <m:r>
+              <m:t>D</m:t>
+            </m:r>
+          </m:e>
+          <m:sub>
+            <m:r>
+              <m:t>ρ</m:t>
+            </m:r>
+          </m:sub>
+        </m:sSub>
+        <m:sSub>
+          <m:e>
+            <m:r>
+              <m:t>F</m:t>
+            </m:r>
+          </m:e>
+          <m:sub>
+            <m:r>
+              <m:t>μ</m:t>
+            </m:r>
+            <m:r>
+              <m:t>ν</m:t>
+            </m:r>
+          </m:sub>
+        </m:sSub>
+      </m:oMath>
+      <w:r>
+        <w:t xml:space="preserve">. Gauge-invariant lattice composites</w:t>
+      </w:r>
+      <w:r>
+        <w:t xml:space="preserve"> </w:t>
+      </w:r>
+      <m:oMath>
+        <m:sSubSup>
+          <m:e>
+            <m:r>
+              <m:t>P</m:t>
+            </m:r>
+          </m:e>
+          <m:sub>
+            <m:r>
+              <m:t>j</m:t>
+            </m:r>
+          </m:sub>
+          <m:sup>
+            <m:d>
+              <m:dPr>
+                <m:begChr m:val="("/>
+                <m:endChr m:val=")"/>
+                <m:sepChr m:val=""/>
+                <m:grow/>
+              </m:dPr>
+              <m:e>
+                <m:r>
+                  <m:t>a</m:t>
+                </m:r>
+              </m:e>
+            </m:d>
+          </m:sup>
+        </m:sSubSup>
+      </m:oMath>
+      <w:r>
+        <w:t xml:space="preserve"> </w:t>
+      </w:r>
+      <w:r>
+        <w:t xml:space="preserve">are then mixed and renormalized by a finite matrix at each engineering dimension,</w:t>
+      </w:r>
+    </w:p>
+    <w:p>
+      <w:pPr>
+        <w:pStyle w:val="BodyText"/>
+      </w:pPr>
+      <m:oMathPara>
+        <m:oMathParaPr>
+          <m:jc m:val="center"/>
+        </m:oMathParaPr>
+        <m:oMath>
+          <m:sSubSup>
+            <m:e>
+              <m:r>
+                <m:rPr>
+                  <m:sty m:val="p"/>
+                  <m:scr m:val="script"/>
+                </m:rPr>
+                <m:t>O</m:t>
+              </m:r>
+            </m:e>
+            <m:sub>
+              <m:r>
+                <m:t>P</m:t>
+              </m:r>
+            </m:sub>
+            <m:sup>
+              <m:d>
+                <m:dPr>
+                  <m:begChr m:val="("/>
+                  <m:endChr m:val=")"/>
+                  <m:sepChr m:val=""/>
+                  <m:grow/>
+                </m:dPr>
+                <m:e>
+                  <m:r>
+                    <m:t>a</m:t>
+                  </m:r>
+                </m:e>
+              </m:d>
+            </m:sup>
+          </m:sSubSup>
+          <m:r>
+            <m:rPr>
+              <m:sty m:val="p"/>
+            </m:rPr>
+            <m:t>=</m:t>
+          </m:r>
+          <m:nary>
+            <m:naryPr>
+              <m:chr m:val="∑"/>
+              <m:limLoc m:val="undOvr"/>
+              <m:subHide m:val="off"/>
+              <m:supHide m:val="on"/>
+            </m:naryPr>
+            <m:sub>
+              <m:r>
+                <m:t>j</m:t>
+              </m:r>
+              <m:r>
+                <m:rPr>
+                  <m:sty m:val="p"/>
+                </m:rPr>
+                <m:t>:</m:t>
+              </m:r>
+              <m:r>
+                <m:t> </m:t>
+              </m:r>
+              <m:sSub>
+                <m:e>
+                  <m:r>
+                    <m:t>d</m:t>
+                  </m:r>
+                </m:e>
+                <m:sub>
+                  <m:r>
+                    <m:t>j</m:t>
+                  </m:r>
+                </m:sub>
+              </m:sSub>
+              <m:r>
+                <m:rPr>
+                  <m:sty m:val="p"/>
+                </m:rPr>
+                <m:t>≤</m:t>
+              </m:r>
+              <m:sSub>
+                <m:e>
+                  <m:r>
+                    <m:t>d</m:t>
+                  </m:r>
+                </m:e>
+                <m:sub>
+                  <m:r>
+                    <m:t>P</m:t>
+                  </m:r>
+                </m:sub>
+              </m:sSub>
+            </m:sub>
+            <m:sup>
+              <m:r>
+                <m:t>​</m:t>
+              </m:r>
+            </m:sup>
+            <m:e>
+              <m:sSub>
+                <m:e>
+                  <m:r>
+                    <m:t>Z</m:t>
+                  </m:r>
+                </m:e>
+                <m:sub>
+                  <m:r>
+                    <m:t>P</m:t>
+                  </m:r>
+                  <m:r>
+                    <m:t>j</m:t>
+                  </m:r>
+                </m:sub>
+              </m:sSub>
+            </m:e>
+          </m:nary>
+          <m:d>
+            <m:dPr>
+              <m:begChr m:val="("/>
+              <m:endChr m:val=")"/>
+              <m:sepChr m:val=""/>
+              <m:grow/>
+            </m:dPr>
+            <m:e>
+              <m:r>
+                <m:t>a</m:t>
+              </m:r>
+              <m:r>
+                <m:rPr>
+                  <m:sty m:val="p"/>
+                </m:rPr>
+                <m:t>,</m:t>
+              </m:r>
+              <m:r>
+                <m:t>μ</m:t>
+              </m:r>
+            </m:e>
+          </m:d>
+          <m:sSubSup>
+            <m:e>
+              <m:r>
+                <m:t>P</m:t>
+              </m:r>
+            </m:e>
+            <m:sub>
+              <m:r>
+                <m:t>j</m:t>
+              </m:r>
+            </m:sub>
+            <m:sup>
+              <m:d>
+                <m:dPr>
+                  <m:begChr m:val="("/>
+                  <m:endChr m:val=")"/>
+                  <m:sepChr m:val=""/>
+                  <m:grow/>
+                </m:dPr>
+                <m:e>
+                  <m:r>
+                    <m:t>a</m:t>
+                  </m:r>
+                </m:e>
+              </m:d>
+            </m:sup>
+          </m:sSubSup>
+          <m:r>
+            <m:rPr>
+              <m:sty m:val="p"/>
+            </m:rPr>
+            <m:t>.</m:t>
+          </m:r>
+        </m:oMath>
+      </m:oMathPara>
+    </w:p>
+    <w:p>
+      <w:pPr>
+        <w:pStyle w:val="FirstParagraph"/>
+      </w:pPr>
+      <w:r>
+        <w:t xml:space="preserve">The required continuum statement is:</w:t>
+      </w:r>
+    </w:p>
+    <w:p>
+      <w:pPr>
+        <w:pStyle w:val="BodyText"/>
+      </w:pPr>
+      <w:r>
+        <w:rPr>
+          <w:bCs/>
+          <w:b/>
+        </w:rPr>
+        <w:t xml:space="preserve">Bridge Lemma B4 (composite-field convergence).</w:t>
+      </w:r>
+      <w:r>
+        <w:t xml:space="preserve"> </w:t>
+      </w:r>
+      <w:r>
+        <w:t xml:space="preserve">For every gauge-invariant differential polynomial</w:t>
+      </w:r>
+      <w:r>
+        <w:t xml:space="preserve"> </w:t>
+      </w:r>
+      <m:oMath>
+        <m:r>
+          <m:t>P</m:t>
+        </m:r>
+        <m:d>
+          <m:dPr>
+            <m:begChr m:val="("/>
+            <m:endChr m:val=")"/>
+            <m:sepChr m:val=""/>
+            <m:grow/>
+          </m:dPr>
+          <m:e>
+            <m:r>
+              <m:t>F</m:t>
+            </m:r>
+            <m:r>
+              <m:rPr>
+                <m:sty m:val="p"/>
+              </m:rPr>
+              <m:t>,</m:t>
+            </m:r>
+            <m:r>
+              <m:t>D</m:t>
+            </m:r>
+            <m:r>
+              <m:t>F</m:t>
+            </m:r>
+            <m:r>
+              <m:rPr>
+                <m:sty m:val="p"/>
+              </m:rPr>
+              <m:t>,</m:t>
+            </m:r>
+            <m:r>
+              <m:rPr>
+                <m:sty m:val="p"/>
+              </m:rPr>
+              <m:t>…</m:t>
+            </m:r>
+          </m:e>
+        </m:d>
+      </m:oMath>
+      <w:r>
+        <w:t xml:space="preserve"> </w:t>
+      </w:r>
+      <w:r>
+        <w:t xml:space="preserve">there is a renormalized lattice approximant</w:t>
+      </w:r>
+      <w:r>
+        <w:t xml:space="preserve"> </w:t>
+      </w:r>
+      <m:oMath>
+        <m:sSubSup>
+          <m:e>
+            <m:r>
+              <m:rPr>
+                <m:sty m:val="p"/>
+                <m:scr m:val="script"/>
+              </m:rPr>
+              <m:t>O</m:t>
+            </m:r>
+          </m:e>
+          <m:sub>
+            <m:r>
+              <m:t>P</m:t>
+            </m:r>
+          </m:sub>
+          <m:sup>
+            <m:d>
+              <m:dPr>
+                <m:begChr m:val="("/>
+                <m:endChr m:val=")"/>
+                <m:sepChr m:val=""/>
+                <m:grow/>
+              </m:dPr>
+              <m:e>
+                <m:r>
+                  <m:t>a</m:t>
+                </m:r>
+              </m:e>
+            </m:d>
+          </m:sup>
+        </m:sSubSup>
+      </m:oMath>
+      <w:r>
+        <w:t xml:space="preserve"> </w:t>
+      </w:r>
+      <w:r>
+        <w:t xml:space="preserve">such that all mixed Schwinger distributions containing finitely many such insertions converge in</w:t>
+      </w:r>
+      <w:r>
+        <w:t xml:space="preserve"> </w:t>
+      </w:r>
+      <m:oMath>
+        <m:r>
+          <m:rPr>
+            <m:sty m:val="p"/>
+            <m:scr m:val="script"/>
+          </m:rPr>
+          <m:t>S</m:t>
+        </m:r>
+        <m:r>
+          <m:rPr>
+            <m:sty m:val="p"/>
+          </m:rPr>
+          <m:t>′</m:t>
+        </m:r>
+      </m:oMath>
+      <w:r>
+        <w:t xml:space="preserve"> </w:t>
+      </w:r>
+      <w:r>
+        <w:t xml:space="preserve">as</w:t>
+      </w:r>
+      <w:r>
+        <w:t xml:space="preserve"> </w:t>
+      </w:r>
+      <m:oMath>
+        <m:r>
+          <m:t>a</m:t>
+        </m:r>
+        <m:r>
+          <m:rPr>
+            <m:sty m:val="p"/>
+          </m:rPr>
+          <m:t>→</m:t>
+        </m:r>
+        <m:r>
+          <m:t>0</m:t>
+        </m:r>
+      </m:oMath>
+      <w:r>
+        <w:t xml:space="preserve">, and the limiting operators transform covariantly under the restored Euclidean group.</w:t>
+      </w:r>
+    </w:p>
+    <w:p>
+      <w:pPr>
+        <w:pStyle w:val="BodyText"/>
+      </w:pPr>
+      <w:r>
+        <w:t xml:space="preserve">The stress tensor is obtained by differentiating an anisotropic/background-metric lattice action with respect to the metric and then renormalizing the finite set of operators allowed by symmetry. Its continuum Ward identity is</w:t>
+      </w:r>
+    </w:p>
+    <w:p>
+      <w:pPr>
+        <w:pStyle w:val="BodyText"/>
+      </w:pPr>
+      <m:oMathPara>
+        <m:oMathParaPr>
+          <m:jc m:val="center"/>
+        </m:oMathParaPr>
+        <m:oMath>
+          <m:sSup>
+            <m:e>
+              <m:r>
+                <m:rPr>
+                  <m:sty m:val="p"/>
+                </m:rPr>
+                <m:t>∂</m:t>
+              </m:r>
+            </m:e>
+            <m:sup>
+              <m:r>
+                <m:t>μ</m:t>
+              </m:r>
+            </m:sup>
+          </m:sSup>
+          <m:sSub>
+            <m:e>
+              <m:r>
+                <m:t>T</m:t>
+              </m:r>
+            </m:e>
+            <m:sub>
+              <m:r>
+                <m:t>μ</m:t>
+              </m:r>
+              <m:r>
+                <m:t>ν</m:t>
+              </m:r>
+            </m:sub>
+          </m:sSub>
+          <m:r>
+            <m:rPr>
+              <m:sty m:val="p"/>
+            </m:rPr>
+            <m:t>=</m:t>
+          </m:r>
+          <m:r>
+            <m:t>0</m:t>
+          </m:r>
+          <m:r>
+            <m:rPr>
+              <m:sty m:val="p"/>
+            </m:rPr>
+            <m:t>,</m:t>
+          </m:r>
+        </m:oMath>
+      </m:oMathPara>
+    </w:p>
+    <w:p>
+      <w:pPr>
+        <w:pStyle w:val="FirstParagraph"/>
+      </w:pPr>
+      <w:r>
+        <w:t xml:space="preserve">and after OS reconstruction</w:t>
+      </w:r>
+    </w:p>
+    <w:p>
+      <w:pPr>
+        <w:pStyle w:val="BodyText"/>
+      </w:pPr>
+      <m:oMathPara>
+        <m:oMathParaPr>
+          <m:jc m:val="center"/>
+        </m:oMathParaPr>
+        <m:oMath>
+          <m:r>
+            <m:t>H</m:t>
+          </m:r>
+          <m:r>
+            <m:rPr>
+              <m:sty m:val="p"/>
+            </m:rPr>
+            <m:t>=</m:t>
+          </m:r>
+          <m:nary>
+            <m:naryPr>
+              <m:chr m:val="∫"/>
+              <m:limLoc m:val="subSup"/>
+              <m:subHide m:val="off"/>
+              <m:supHide m:val="on"/>
+            </m:naryPr>
+            <m:sub>
+              <m:sSup>
+                <m:e>
+                  <m:r>
+                    <m:rPr>
+                      <m:sty m:val="p"/>
+                      <m:scr m:val="double-struck"/>
+                    </m:rPr>
+                    <m:t>R</m:t>
+                  </m:r>
+                </m:e>
+                <m:sup>
+                  <m:r>
+                    <m:t>3</m:t>
+                  </m:r>
+                </m:sup>
+              </m:sSup>
+            </m:sub>
+            <m:sup>
+              <m:r>
+                <m:t>​</m:t>
+              </m:r>
+            </m:sup>
+            <m:e>
+              <m:sSub>
+                <m:e>
+                  <m:r>
+                    <m:t>T</m:t>
+                  </m:r>
+                </m:e>
+                <m:sub>
+                  <m:r>
+                    <m:t>00</m:t>
+                  </m:r>
+                </m:sub>
+              </m:sSub>
+            </m:e>
+          </m:nary>
+          <m:d>
+            <m:dPr>
+              <m:begChr m:val="("/>
+              <m:endChr m:val=")"/>
+              <m:sepChr m:val=""/>
+              <m:grow/>
+            </m:dPr>
+            <m:e>
+              <m:r>
+                <m:t>0</m:t>
+              </m:r>
+              <m:r>
+                <m:rPr>
+                  <m:sty m:val="p"/>
+                </m:rPr>
+                <m:t>,</m:t>
+              </m:r>
+              <m:r>
+                <m:rPr>
+                  <m:sty m:val="b"/>
+                </m:rPr>
+                <m:t>x</m:t>
+              </m:r>
+            </m:e>
+          </m:d>
+          <m:r>
+            <m:t> </m:t>
+          </m:r>
+          <m:sSup>
+            <m:e>
+              <m:r>
+                <m:t>d</m:t>
+              </m:r>
+            </m:e>
+            <m:sup>
+              <m:r>
+                <m:t>3</m:t>
+              </m:r>
+            </m:sup>
+          </m:sSup>
+          <m:r>
+            <m:t>x</m:t>
+          </m:r>
+        </m:oMath>
+      </m:oMathPara>
+    </w:p>
+    <w:p>
+      <w:pPr>
+        <w:pStyle w:val="FirstParagraph"/>
+      </w:pPr>
+      <w:r>
+        <w:t xml:space="preserve">in the standard quadratic-form sense on the energy domain.</w:t>
+      </w:r>
+    </w:p>
+    <w:p>
+      <w:pPr>
+        <w:pStyle w:val="BodyText"/>
+      </w:pPr>
+      <w:r>
+        <w:t xml:space="preserve">At short distance, asymptotic freedom fixes the ultraviolet coefficients in products of local fields. The required operator-product statement is</w:t>
+      </w:r>
+    </w:p>
+    <w:p>
+      <w:pPr>
+        <w:pStyle w:val="BodyText"/>
+      </w:pPr>
+      <m:oMathPara>
+        <m:oMathParaPr>
+          <m:jc m:val="center"/>
+        </m:oMathParaPr>
+        <m:oMath>
+          <m:sSub>
+            <m:e>
+              <m:r>
+                <m:rPr>
+                  <m:sty m:val="p"/>
+                  <m:scr m:val="script"/>
+                </m:rPr>
+                <m:t>O</m:t>
+              </m:r>
+            </m:e>
+            <m:sub>
+              <m:r>
+                <m:t>P</m:t>
+              </m:r>
+            </m:sub>
+          </m:sSub>
+          <m:d>
+            <m:dPr>
+              <m:begChr m:val="("/>
+              <m:endChr m:val=")"/>
+              <m:sepChr m:val=""/>
+              <m:grow/>
+            </m:dPr>
+            <m:e>
+              <m:r>
+                <m:t>x</m:t>
+              </m:r>
+            </m:e>
+          </m:d>
+          <m:sSub>
+            <m:e>
+              <m:r>
+                <m:rPr>
+                  <m:sty m:val="p"/>
+                  <m:scr m:val="script"/>
+                </m:rPr>
+                <m:t>O</m:t>
+              </m:r>
+            </m:e>
+            <m:sub>
+              <m:r>
+                <m:t>Q</m:t>
+              </m:r>
+            </m:sub>
+          </m:sSub>
+          <m:d>
+            <m:dPr>
+              <m:begChr m:val="("/>
+              <m:endChr m:val=")"/>
+              <m:sepChr m:val=""/>
+              <m:grow/>
+            </m:dPr>
+            <m:e>
+              <m:r>
+                <m:t>0</m:t>
+              </m:r>
+            </m:e>
+          </m:d>
+          <m:r>
+            <m:rPr>
+              <m:sty m:val="p"/>
+            </m:rPr>
+            <m:t>∼</m:t>
+          </m:r>
+          <m:nary>
+            <m:naryPr>
+              <m:chr m:val="∑"/>
+              <m:limLoc m:val="undOvr"/>
+              <m:subHide m:val="off"/>
+              <m:supHide m:val="on"/>
+            </m:naryPr>
+            <m:sub>
+              <m:r>
+                <m:t>R</m:t>
+              </m:r>
+            </m:sub>
+            <m:sup>
+              <m:r>
+                <m:t>​</m:t>
+              </m:r>
+            </m:sup>
+            <m:e>
+              <m:sSubSup>
+                <m:e>
+                  <m:r>
+                    <m:t>C</m:t>
+                  </m:r>
+                </m:e>
+                <m:sub>
+                  <m:r>
+                    <m:t>P</m:t>
+                  </m:r>
+                  <m:r>
+                    <m:t>Q</m:t>
+                  </m:r>
+                </m:sub>
+                <m:sup>
+                  <m:r>
+                    <m:t> </m:t>
+                  </m:r>
+                  <m:r>
+                    <m:t>R</m:t>
+                  </m:r>
+                </m:sup>
+              </m:sSubSup>
+            </m:e>
+          </m:nary>
+          <m:d>
+            <m:dPr>
+              <m:begChr m:val="("/>
+              <m:endChr m:val=")"/>
+              <m:sepChr m:val=""/>
+              <m:grow/>
+            </m:dPr>
+            <m:e>
+              <m:r>
+                <m:t>x</m:t>
+              </m:r>
+              <m:r>
+                <m:rPr>
+                  <m:sty m:val="p"/>
+                </m:rPr>
+                <m:t>,</m:t>
+              </m:r>
+              <m:r>
+                <m:t>μ</m:t>
+              </m:r>
+              <m:r>
+                <m:rPr>
+                  <m:sty m:val="p"/>
+                </m:rPr>
+                <m:t>,</m:t>
+              </m:r>
+              <m:r>
+                <m:t>g</m:t>
+              </m:r>
+              <m:d>
+                <m:dPr>
+                  <m:begChr m:val="("/>
+                  <m:endChr m:val=")"/>
+                  <m:sepChr m:val=""/>
+                  <m:grow/>
+                </m:dPr>
+                <m:e>
+                  <m:r>
+                    <m:t>μ</m:t>
+                  </m:r>
+                </m:e>
+              </m:d>
+            </m:e>
+          </m:d>
+          <m:sSub>
+            <m:e>
+              <m:r>
+                <m:rPr>
+                  <m:sty m:val="p"/>
+                  <m:scr m:val="script"/>
+                </m:rPr>
+                <m:t>O</m:t>
+              </m:r>
+            </m:e>
+            <m:sub>
+              <m:r>
+                <m:t>R</m:t>
+              </m:r>
+            </m:sub>
+          </m:sSub>
+          <m:d>
+            <m:dPr>
+              <m:begChr m:val="("/>
+              <m:endChr m:val=")"/>
+              <m:sepChr m:val=""/>
+              <m:grow/>
+            </m:dPr>
+            <m:e>
+              <m:r>
+                <m:t>0</m:t>
+              </m:r>
+            </m:e>
+          </m:d>
+          <m:r>
+            <m:rPr>
+              <m:sty m:val="p"/>
+            </m:rPr>
+            <m:t>,</m:t>
+          </m:r>
+          <m:r>
+            <m:t>  </m:t>
+          </m:r>
+          <m:d>
+            <m:dPr>
+              <m:begChr m:val="|"/>
+              <m:endChr m:val="|"/>
+              <m:sepChr m:val=""/>
+              <m:grow/>
+            </m:dPr>
+            <m:e>
+              <m:r>
+                <m:t>x</m:t>
+              </m:r>
+            </m:e>
+          </m:d>
+          <m:r>
+            <m:rPr>
+              <m:sty m:val="p"/>
+            </m:rPr>
+            <m:t>↓</m:t>
+          </m:r>
+          <m:r>
+            <m:t>0</m:t>
+          </m:r>
+          <m:r>
+            <m:rPr>
+              <m:sty m:val="p"/>
+            </m:rPr>
+            <m:t>,</m:t>
+          </m:r>
+        </m:oMath>
+      </m:oMathPara>
+    </w:p>
+    <w:p>
+      <w:pPr>
+        <w:pStyle w:val="FirstParagraph"/>
+      </w:pPr>
+      <w:r>
+        <w:t xml:space="preserve">with</w:t>
+      </w:r>
+      <w:r>
+        <w:t xml:space="preserve"> </w:t>
+      </w:r>
+      <m:oMath>
+        <m:r>
+          <m:t>g</m:t>
+        </m:r>
+        <m:d>
+          <m:dPr>
+            <m:begChr m:val="("/>
+            <m:endChr m:val=")"/>
+            <m:sepChr m:val=""/>
+            <m:grow/>
+          </m:dPr>
+          <m:e>
+            <m:r>
+              <m:t>μ</m:t>
+            </m:r>
+          </m:e>
+        </m:d>
+        <m:r>
+          <m:rPr>
+            <m:sty m:val="p"/>
+          </m:rPr>
+          <m:t>→</m:t>
+        </m:r>
+        <m:r>
+          <m:t>0</m:t>
+        </m:r>
+      </m:oMath>
+      <w:r>
+        <w:t xml:space="preserve"> </w:t>
+      </w:r>
+      <w:r>
+        <w:t xml:space="preserve">as</w:t>
+      </w:r>
+      <w:r>
+        <w:t xml:space="preserve"> </w:t>
+      </w:r>
+      <m:oMath>
+        <m:r>
+          <m:t>μ</m:t>
+        </m:r>
+        <m:r>
+          <m:rPr>
+            <m:sty m:val="p"/>
+          </m:rPr>
+          <m:t>→</m:t>
+        </m:r>
+        <m:r>
+          <m:rPr>
+            <m:sty m:val="p"/>
+          </m:rPr>
+          <m:t>∞</m:t>
+        </m:r>
+      </m:oMath>
+      <w:r>
+        <w:t xml:space="preserve"> </w:t>
+      </w:r>
+      <w:r>
+        <w:t xml:space="preserve">and Wilson coefficients having the perturbative asymptotic expansion determined by Yang–Mills renormalization.</w:t>
+      </w:r>
+    </w:p>
+    <w:p>
+      <w:pPr>
+        <w:pStyle w:val="BodyText"/>
+      </w:pPr>
+      <w:r>
+        <w:rPr>
+          <w:bCs/>
+          <w:b/>
+        </w:rPr>
+        <w:t xml:space="preserve">Bridge Lemma B5 (short-distance matching).</w:t>
+      </w:r>
+      <w:r>
+        <w:t xml:space="preserve"> </w:t>
+      </w:r>
+      <w:r>
+        <w:t xml:space="preserve">The renormalized continuum composite fields of B4 obey the Yang–Mills Ward identities and their short-distance Schwinger distributions have the asymptotic-freedom/OPE singular structure fixed by perturbative renormalization. In particular a conserved renormalized stress tensor exists.</w:t>
+      </w:r>
+    </w:p>
+    <w:p>
+      <w:pPr>
+        <w:pStyle w:val="BodyText"/>
+      </w:pPr>
+      <w:r>
+        <w:t xml:space="preserve">B4 and B5 are the exact operator-theoretic form of the local-field and ultraviolet requirements in the Jaffe–Witten problem statement; they prevent a merely gapped lattice theory from being substituted for four-dimensional quantum Yang–Mills.</w:t>
+      </w:r>
+    </w:p>
+    <w:bookmarkEnd w:id="36"/>
+    <w:bookmarkStart w:id="37" w:name="X04db9635e6b096c532c66877395a0d22a1208ce"/>
     <w:p>
       <w:pPr>
         <w:pStyle w:val="Heading1"/>
@@ -14788,8 +16204,8 @@
         <w:t xml:space="preserve">rather than only the hypercubic subgroup, with all Lorentz-breaking irrelevant operators vanishing under the renormalized trajectory.</w:t>
       </w:r>
     </w:p>
-    <w:bookmarkEnd w:id="36"/>
-    <w:bookmarkStart w:id="37" w:name="c-osterwalderschrader-reconstruction"/>
+    <w:bookmarkEnd w:id="37"/>
+    <w:bookmarkStart w:id="38" w:name="c-osterwalderschrader-reconstruction"/>
     <w:p>
       <w:pPr>
         <w:pStyle w:val="Heading1"/>
@@ -14803,7 +16219,7 @@
         <w:pStyle w:val="FirstParagraph"/>
       </w:pPr>
       <w:r>
-        <w:t xml:space="preserve">Assume B1–B3 and C1 together with the standard OS regularity bounds. Then the limiting Schwinger family satisfies the reconstruction hypotheses. The OS quotient is formed from positive-time test polynomials by</w:t>
+        <w:t xml:space="preserve">Assume B1–B5 and C1 together with the standard OS regularity bounds. Then the limiting Schwinger family satisfies the reconstruction hypotheses. The OS quotient is formed from positive-time test polynomials by</w:t>
       </w:r>
     </w:p>
     <w:p>
@@ -15160,8 +16576,8 @@
         </m:oMath>
       </m:oMathPara>
     </w:p>
-    <w:bookmarkEnd w:id="37"/>
-    <w:bookmarkStart w:id="38" w:name="d-spectral-gap-transfer"/>
+    <w:bookmarkEnd w:id="38"/>
+    <w:bookmarkStart w:id="39" w:name="d-spectral-gap-transfer"/>
     <w:p>
       <w:pPr>
         <w:pStyle w:val="Heading1"/>
@@ -16443,8 +17859,8 @@
         </m:oMath>
       </m:oMathPara>
     </w:p>
-    <w:bookmarkEnd w:id="38"/>
-    <w:bookmarkStart w:id="39" w:name="X40c668e57f25c0c511dc0a65236c403abcc1ca5"/>
+    <w:bookmarkEnd w:id="39"/>
+    <w:bookmarkStart w:id="40" w:name="X40c668e57f25c0c511dc0a65236c403abcc1ca5"/>
     <w:p>
       <w:pPr>
         <w:pStyle w:val="Heading1"/>
@@ -16703,8 +18119,8 @@
         <w:t xml:space="preserve">places spectrum at finite positive energy. The continuum nontriviality lemma B3 supplies the required non-vacuum local sector.</w:t>
       </w:r>
     </w:p>
-    <w:bookmarkEnd w:id="39"/>
-    <w:bookmarkStart w:id="40" w:name="arbitrary-compact-simple-gauge-group"/>
+    <w:bookmarkEnd w:id="40"/>
+    <w:bookmarkStart w:id="41" w:name="arbitrary-compact-simple-gauge-group"/>
     <w:p>
       <w:pPr>
         <w:pStyle w:val="Heading1"/>
@@ -17076,8 +18492,8 @@
         <w:t xml:space="preserve">be universal across different groups.</w:t>
       </w:r>
     </w:p>
-    <w:bookmarkEnd w:id="40"/>
-    <w:bookmarkStart w:id="41" w:name="positivity-bootstrap-cross-check-lane"/>
+    <w:bookmarkEnd w:id="41"/>
+    <w:bookmarkStart w:id="42" w:name="positivity-bootstrap-cross-check-lane"/>
     <w:p>
       <w:pPr>
         <w:pStyle w:val="Heading1"/>
@@ -17265,8 +18681,8 @@
         <w:t xml:space="preserve">entering Bridge Lemma A rather than merely bound the plaquette expectation.</w:t>
       </w:r>
     </w:p>
-    <w:bookmarkEnd w:id="41"/>
-    <w:bookmarkStart w:id="42" w:name="machine-verifiable-results"/>
+    <w:bookmarkEnd w:id="42"/>
+    <w:bookmarkStart w:id="43" w:name="machine-verifiable-results"/>
     <w:p>
       <w:pPr>
         <w:pStyle w:val="Heading1"/>
@@ -17551,8 +18967,8 @@
         <w:t xml:space="preserve">.</w:t>
       </w:r>
     </w:p>
-    <w:bookmarkEnd w:id="42"/>
-    <w:bookmarkStart w:id="43" w:name="jaffewitten-proof-ledger"/>
+    <w:bookmarkEnd w:id="43"/>
+    <w:bookmarkStart w:id="44" w:name="jaffewitten-proof-ledger"/>
     <w:p>
       <w:pPr>
         <w:pStyle w:val="Heading1"/>
@@ -17964,8 +19380,8 @@
         <w:t xml:space="preserve">The ledger deliberately separates a theorem already proved in the package, a standard theorem invoked from the literature, and a bridge lemma that must be discharged by the UCD/Wilson construction. That separation is part of the proof object: no finite-matrix eigenvalue is silently relabeled as a continuum mass.</w:t>
       </w:r>
     </w:p>
-    <w:bookmarkEnd w:id="43"/>
-    <w:bookmarkStart w:id="44" w:name="reproducibility"/>
+    <w:bookmarkEnd w:id="44"/>
+    <w:bookmarkStart w:id="45" w:name="reproducibility"/>
     <w:p>
       <w:pPr>
         <w:pStyle w:val="Heading1"/>
@@ -18091,8 +19507,8 @@
         <w:t xml:space="preserve">.</w:t>
       </w:r>
     </w:p>
-    <w:bookmarkEnd w:id="44"/>
-    <w:bookmarkStart w:id="45" w:name="conclusion"/>
+    <w:bookmarkEnd w:id="45"/>
+    <w:bookmarkStart w:id="46" w:name="conclusion"/>
     <w:p>
       <w:pPr>
         <w:pStyle w:val="Heading1"/>
@@ -18482,8 +19898,8 @@
         </m:oMath>
       </m:oMathPara>
     </w:p>
-    <w:bookmarkEnd w:id="45"/>
-    <w:bookmarkStart w:id="46" w:name="references"/>
+    <w:bookmarkEnd w:id="46"/>
+    <w:bookmarkStart w:id="47" w:name="references"/>
     <w:p>
       <w:pPr>
         <w:pStyle w:val="Heading1"/>
@@ -18855,7 +20271,7 @@
         <w:t xml:space="preserve">, Springer.</w:t>
       </w:r>
     </w:p>
-    <w:bookmarkEnd w:id="46"/>
+    <w:bookmarkEnd w:id="47"/>
     <w:sectPr/>
   </w:body>
 </w:document>

</xml_diff>